<commit_message>
update IP2 prototype and testing plan
</commit_message>
<xml_diff>
--- a/Documentation/Evaluation2/IP2 Testing Plan.docx
+++ b/Documentation/Evaluation2/IP2 Testing Plan.docx
@@ -22,7 +22,40 @@
           <w:szCs w:val="40"/>
           <w:lang w:eastAsia="zh-CN"/>
         </w:rPr>
-        <w:t>Procreate for VR</w:t>
+        <w:t xml:space="preserve">Procreate for </w:t>
+      </w:r>
+      <w:r>
+        <w:rPr>
+          <w:rFonts w:ascii="Aptos" w:eastAsiaTheme="minorHAnsi" w:hAnsi="Aptos"/>
+          <w:b/>
+          <w:bCs/>
+          <w:sz w:val="40"/>
+          <w:szCs w:val="40"/>
+          <w:lang w:val="en-AU" w:eastAsia="zh-CN"/>
+        </w:rPr>
+        <w:t>V</w:t>
+      </w:r>
+      <w:r>
+        <w:rPr>
+          <w:rFonts w:ascii="Aptos" w:eastAsiaTheme="minorHAnsi" w:hAnsi="Aptos"/>
+          <w:b/>
+          <w:bCs/>
+          <w:sz w:val="40"/>
+          <w:szCs w:val="40"/>
+          <w:lang w:eastAsia="zh-CN"/>
+        </w:rPr>
+        <w:t>R</w:t>
+      </w:r>
+      <w:r>
+        <w:rPr>
+          <w:rFonts w:ascii="Aptos" w:eastAsiaTheme="minorHAnsi" w:hAnsi="Aptos"/>
+          <w:b/>
+          <w:bCs/>
+          <w:sz w:val="40"/>
+          <w:szCs w:val="40"/>
+          <w:lang w:eastAsia="zh-CN"/>
+        </w:rPr>
+        <w:t xml:space="preserve"> with Passthrough</w:t>
       </w:r>
     </w:p>
     <w:p>
@@ -159,7 +192,19 @@
         <w:rPr>
           <w:rFonts w:ascii="Aptos" w:hAnsi="Aptos"/>
         </w:rPr>
-        <w:t>Scale the canvas using two-hand gestures.</w:t>
+        <w:t>Scale</w:t>
+      </w:r>
+      <w:r>
+        <w:rPr>
+          <w:rFonts w:ascii="Aptos" w:hAnsi="Aptos"/>
+        </w:rPr>
+        <w:t xml:space="preserve"> and move</w:t>
+      </w:r>
+      <w:r>
+        <w:rPr>
+          <w:rFonts w:ascii="Aptos" w:hAnsi="Aptos"/>
+        </w:rPr>
+        <w:t xml:space="preserve"> the canvas using two-hand gestures.</w:t>
       </w:r>
     </w:p>
     <w:p>
@@ -178,7 +223,19 @@
         <w:rPr>
           <w:rFonts w:ascii="Aptos" w:hAnsi="Aptos"/>
         </w:rPr>
-        <w:t>Move tools (pen/eraser) and reposition the canvas in the XR environment.</w:t>
+        <w:t xml:space="preserve">Move tools (pen/eraser) and reposition the canvas in the </w:t>
+      </w:r>
+      <w:r>
+        <w:rPr>
+          <w:rFonts w:ascii="Aptos" w:hAnsi="Aptos"/>
+        </w:rPr>
+        <w:t>V</w:t>
+      </w:r>
+      <w:r>
+        <w:rPr>
+          <w:rFonts w:ascii="Aptos" w:hAnsi="Aptos"/>
+        </w:rPr>
+        <w:t>R environment.</w:t>
       </w:r>
     </w:p>
     <w:p>
@@ -653,6 +710,7 @@
           <w:lang w:eastAsia="zh-CN"/>
         </w:rPr>
       </w:pPr>
+      <w:bookmarkStart w:id="1" w:name="OLE_LINK28"/>
       <w:r>
         <w:rPr>
           <w:rFonts w:ascii="Aptos" w:hAnsi="Aptos"/>
@@ -675,7 +733,7 @@
           <w:lang w:eastAsia="zh-CN"/>
         </w:rPr>
       </w:pPr>
-      <w:bookmarkStart w:id="1" w:name="OLE_LINK23"/>
+      <w:bookmarkStart w:id="2" w:name="OLE_LINK23"/>
       <w:r>
         <w:rPr>
           <w:rFonts w:ascii="Aptos" w:hAnsi="Aptos"/>
@@ -683,7 +741,7 @@
         </w:rPr>
         <w:t xml:space="preserve">Explain the prototype and its purpose. </w:t>
       </w:r>
-      <w:bookmarkStart w:id="2" w:name="OLE_LINK21"/>
+      <w:bookmarkStart w:id="3" w:name="OLE_LINK21"/>
       <w:r>
         <w:rPr>
           <w:rFonts w:ascii="Aptos" w:hAnsi="Aptos"/>
@@ -691,7 +749,7 @@
         </w:rPr>
         <w:t>(20s)</w:t>
       </w:r>
-      <w:bookmarkEnd w:id="2"/>
+      <w:bookmarkEnd w:id="3"/>
     </w:p>
     <w:p>
       <w:pPr>
@@ -745,7 +803,33 @@
         <w:rPr>
           <w:rFonts w:ascii="Aptos" w:hAnsi="Aptos"/>
         </w:rPr>
-        <w:t xml:space="preserve">controller to grab </w:t>
+        <w:t>controller</w:t>
+      </w:r>
+      <w:r>
+        <w:rPr>
+          <w:rFonts w:ascii="Aptos" w:hAnsi="Aptos"/>
+        </w:rPr>
+        <w:t xml:space="preserve">’s </w:t>
+      </w:r>
+      <w:r>
+        <w:rPr>
+          <w:rFonts w:ascii="Aptos" w:hAnsi="Aptos"/>
+          <w:lang w:val="en-AU" w:eastAsia="zh-CN"/>
+        </w:rPr>
+        <w:t>trigger</w:t>
+      </w:r>
+      <w:r>
+        <w:rPr>
+          <w:rFonts w:ascii="Aptos" w:hAnsi="Aptos" w:hint="eastAsia"/>
+          <w:lang w:eastAsia="zh-CN"/>
+        </w:rPr>
+        <w:t xml:space="preserve"> </w:t>
+      </w:r>
+      <w:r>
+        <w:rPr>
+          <w:rFonts w:ascii="Aptos" w:hAnsi="Aptos"/>
+        </w:rPr>
+        <w:t xml:space="preserve">to grab </w:t>
       </w:r>
       <w:r>
         <w:rPr>
@@ -774,7 +858,19 @@
         <w:rPr>
           <w:rFonts w:ascii="Aptos" w:hAnsi="Aptos"/>
         </w:rPr>
-        <w:t>pens and draw a house.</w:t>
+        <w:t>pens and draw a house</w:t>
+      </w:r>
+      <w:r>
+        <w:rPr>
+          <w:rFonts w:ascii="Aptos" w:hAnsi="Aptos"/>
+        </w:rPr>
+        <w:t xml:space="preserve"> on canvas</w:t>
+      </w:r>
+      <w:r>
+        <w:rPr>
+          <w:rFonts w:ascii="Aptos" w:hAnsi="Aptos"/>
+        </w:rPr>
+        <w:t>.</w:t>
       </w:r>
     </w:p>
     <w:p>
@@ -805,14 +901,14 @@
           <w:lang w:eastAsia="zh-CN"/>
         </w:rPr>
       </w:pPr>
-      <w:bookmarkStart w:id="3" w:name="OLE_LINK18"/>
+      <w:bookmarkStart w:id="4" w:name="OLE_LINK18"/>
       <w:r>
         <w:rPr>
           <w:rFonts w:ascii="Aptos" w:hAnsi="Aptos"/>
         </w:rPr>
         <w:t>Grab</w:t>
       </w:r>
-      <w:bookmarkEnd w:id="3"/>
+      <w:bookmarkEnd w:id="4"/>
       <w:r>
         <w:rPr>
           <w:rFonts w:ascii="Aptos" w:hAnsi="Aptos"/>
@@ -883,11 +979,31 @@
           <w:lang w:eastAsia="zh-CN"/>
         </w:rPr>
       </w:pPr>
+      <w:bookmarkStart w:id="5" w:name="OLE_LINK27"/>
       <w:r>
         <w:rPr>
           <w:rFonts w:ascii="Aptos" w:hAnsi="Aptos"/>
         </w:rPr>
-        <w:t>Use both hands to pinch/stretch and resize the canvas.</w:t>
+        <w:t>Use both hands</w:t>
+      </w:r>
+      <w:r>
+        <w:rPr>
+          <w:rFonts w:ascii="Aptos" w:hAnsi="Aptos"/>
+        </w:rPr>
+        <w:t>’ triggers</w:t>
+      </w:r>
+      <w:r>
+        <w:rPr>
+          <w:rFonts w:ascii="Aptos" w:hAnsi="Aptos"/>
+        </w:rPr>
+        <w:t xml:space="preserve"> </w:t>
+      </w:r>
+      <w:bookmarkEnd w:id="5"/>
+      <w:r>
+        <w:rPr>
+          <w:rFonts w:ascii="Aptos" w:hAnsi="Aptos"/>
+        </w:rPr>
+        <w:t>to pinch/stretch and resize the canvas.</w:t>
       </w:r>
     </w:p>
     <w:p>
@@ -914,7 +1030,39 @@
           <w:rFonts w:ascii="Aptos" w:hAnsi="Aptos"/>
         </w:rPr>
         <w:br/>
-        <w:t>Grab and reposition the canvas with one hand to a new location in the environment; you can place it on a nearby wall.</w:t>
+      </w:r>
+      <w:r>
+        <w:rPr>
+          <w:rFonts w:ascii="Aptos" w:hAnsi="Aptos"/>
+        </w:rPr>
+        <w:t xml:space="preserve">Use both hands </w:t>
+      </w:r>
+      <w:r>
+        <w:rPr>
+          <w:rFonts w:ascii="Aptos" w:hAnsi="Aptos" w:hint="eastAsia"/>
+          <w:lang w:eastAsia="zh-CN"/>
+        </w:rPr>
+        <w:t>t</w:t>
+      </w:r>
+      <w:r>
+        <w:rPr>
+          <w:rFonts w:ascii="Aptos" w:hAnsi="Aptos"/>
+          <w:lang w:val="en-AU" w:eastAsia="zh-CN"/>
+        </w:rPr>
+        <w:t xml:space="preserve">o </w:t>
+      </w:r>
+      <w:r>
+        <w:rPr>
+          <w:rFonts w:ascii="Aptos" w:hAnsi="Aptos"/>
+          <w:lang w:eastAsia="zh-CN"/>
+        </w:rPr>
+        <w:t>g</w:t>
+      </w:r>
+      <w:r>
+        <w:rPr>
+          <w:rFonts w:ascii="Aptos" w:hAnsi="Aptos"/>
+        </w:rPr>
+        <w:t>rab and reposition the canvas to a new location in the environment; you can place it on a nearby wall.</w:t>
       </w:r>
     </w:p>
     <w:p>
@@ -945,6 +1093,7 @@
       </w:r>
     </w:p>
     <w:bookmarkEnd w:id="1"/>
+    <w:bookmarkEnd w:id="2"/>
     <w:p>
       <w:pPr>
         <w:rPr>

</xml_diff>

<commit_message>
update IP2 evaluation report
</commit_message>
<xml_diff>
--- a/Documentation/Evaluation2/IP2 Testing Plan.docx
+++ b/Documentation/Evaluation2/IP2 Testing Plan.docx
@@ -707,7 +707,6 @@
           <w:rFonts w:ascii="Aptos" w:hAnsi="Aptos"/>
           <w:b/>
           <w:bCs/>
-          <w:lang w:eastAsia="zh-CN"/>
         </w:rPr>
       </w:pPr>
       <w:bookmarkStart w:id="1" w:name="OLE_LINK28"/>
@@ -730,26 +729,14 @@
         <w:spacing w:after="160" w:line="278" w:lineRule="auto"/>
         <w:rPr>
           <w:rFonts w:ascii="Aptos" w:hAnsi="Aptos"/>
-          <w:lang w:eastAsia="zh-CN"/>
         </w:rPr>
       </w:pPr>
-      <w:bookmarkStart w:id="2" w:name="OLE_LINK23"/>
       <w:r>
         <w:rPr>
           <w:rFonts w:ascii="Aptos" w:hAnsi="Aptos"/>
-          <w:lang w:eastAsia="zh-CN"/>
         </w:rPr>
-        <w:t xml:space="preserve">Explain the prototype and its purpose. </w:t>
+        <w:t>Explain the prototype and its purpose. (20s)</w:t>
       </w:r>
-      <w:bookmarkStart w:id="3" w:name="OLE_LINK21"/>
-      <w:r>
-        <w:rPr>
-          <w:rFonts w:ascii="Aptos" w:hAnsi="Aptos"/>
-          <w:lang w:eastAsia="zh-CN"/>
-        </w:rPr>
-        <w:t>(20s)</w:t>
-      </w:r>
-      <w:bookmarkEnd w:id="3"/>
     </w:p>
     <w:p>
       <w:pPr>
@@ -761,67 +748,61 @@
         <w:spacing w:after="160" w:line="278" w:lineRule="auto"/>
         <w:rPr>
           <w:rFonts w:ascii="Aptos" w:hAnsi="Aptos"/>
-          <w:lang w:eastAsia="zh-CN"/>
         </w:rPr>
       </w:pPr>
       <w:r>
         <w:rPr>
           <w:rFonts w:ascii="Aptos" w:hAnsi="Aptos"/>
         </w:rPr>
-        <w:t xml:space="preserve">Grab and Draw with Pen </w:t>
-      </w:r>
-      <w:r>
-        <w:rPr>
-          <w:rFonts w:ascii="Aptos" w:hAnsi="Aptos"/>
-          <w:lang w:eastAsia="zh-CN"/>
-        </w:rPr>
-        <w:t>(30-40s)</w:t>
-      </w:r>
-    </w:p>
-    <w:p>
-      <w:pPr>
-        <w:pStyle w:val="ListParagraph"/>
-        <w:rPr>
-          <w:rFonts w:ascii="Aptos" w:hAnsi="Aptos"/>
-          <w:lang w:eastAsia="zh-CN"/>
-        </w:rPr>
-      </w:pPr>
-      <w:r>
-        <w:rPr>
-          <w:rFonts w:ascii="Aptos" w:hAnsi="Aptos"/>
-        </w:rPr>
-        <w:t xml:space="preserve">Use </w:t>
-      </w:r>
-      <w:r>
-        <w:rPr>
-          <w:rFonts w:ascii="Aptos" w:hAnsi="Aptos"/>
-          <w:lang w:eastAsia="zh-CN"/>
-        </w:rPr>
-        <w:t xml:space="preserve">the </w:t>
+        <w:t>Grab and Draw with Pen (</w:t>
       </w:r>
       <w:r>
         <w:rPr>
           <w:rFonts w:ascii="Aptos" w:hAnsi="Aptos"/>
         </w:rPr>
-        <w:t>controller</w:t>
+        <w:t>40</w:t>
       </w:r>
       <w:r>
         <w:rPr>
           <w:rFonts w:ascii="Aptos" w:hAnsi="Aptos"/>
         </w:rPr>
-        <w:t xml:space="preserve">’s </w:t>
+        <w:t>-</w:t>
       </w:r>
       <w:r>
         <w:rPr>
           <w:rFonts w:ascii="Aptos" w:hAnsi="Aptos"/>
-          <w:lang w:val="en-AU" w:eastAsia="zh-CN"/>
         </w:rPr>
-        <w:t>trigger</w:t>
+        <w:t>7</w:t>
+      </w:r>
+      <w:r>
+        <w:rPr>
+          <w:rFonts w:ascii="Aptos" w:hAnsi="Aptos"/>
+        </w:rPr>
+        <w:t>0s)</w:t>
+      </w:r>
+    </w:p>
+    <w:p>
+      <w:pPr>
+        <w:pStyle w:val="ListParagraph"/>
+        <w:rPr>
+          <w:rFonts w:ascii="Aptos" w:hAnsi="Aptos"/>
+        </w:rPr>
+      </w:pPr>
+      <w:r>
+        <w:rPr>
+          <w:rFonts w:ascii="Aptos" w:hAnsi="Aptos"/>
+        </w:rPr>
+        <w:t>Use the controller</w:t>
+      </w:r>
+      <w:r>
+        <w:rPr>
+          <w:rFonts w:ascii="Aptos" w:hAnsi="Aptos"/>
+        </w:rPr>
+        <w:t>’s trigger</w:t>
       </w:r>
       <w:r>
         <w:rPr>
           <w:rFonts w:ascii="Aptos" w:hAnsi="Aptos" w:hint="eastAsia"/>
-          <w:lang w:eastAsia="zh-CN"/>
         </w:rPr>
         <w:t xml:space="preserve"> </w:t>
       </w:r>
@@ -829,20 +810,12 @@
         <w:rPr>
           <w:rFonts w:ascii="Aptos" w:hAnsi="Aptos"/>
         </w:rPr>
-        <w:t xml:space="preserve">to grab </w:t>
-      </w:r>
-      <w:r>
-        <w:rPr>
-          <w:rFonts w:ascii="Aptos" w:hAnsi="Aptos"/>
-          <w:lang w:eastAsia="zh-CN"/>
-        </w:rPr>
-        <w:t xml:space="preserve">different </w:t>
+        <w:t xml:space="preserve">to grab different </w:t>
       </w:r>
       <w:proofErr w:type="spellStart"/>
       <w:r>
         <w:rPr>
           <w:rFonts w:ascii="Aptos" w:hAnsi="Aptos"/>
-          <w:lang w:eastAsia="zh-CN"/>
         </w:rPr>
         <w:t>coloured</w:t>
       </w:r>
@@ -850,15 +823,8 @@
       <w:r>
         <w:rPr>
           <w:rFonts w:ascii="Aptos" w:hAnsi="Aptos"/>
-          <w:lang w:eastAsia="zh-CN"/>
         </w:rPr>
-        <w:t xml:space="preserve"> </w:t>
-      </w:r>
-      <w:r>
-        <w:rPr>
-          <w:rFonts w:ascii="Aptos" w:hAnsi="Aptos"/>
-        </w:rPr>
-        <w:t>pens and draw a house</w:t>
+        <w:t xml:space="preserve"> pens and draw a house</w:t>
       </w:r>
       <w:r>
         <w:rPr>
@@ -883,37 +849,39 @@
         <w:spacing w:after="160" w:line="278" w:lineRule="auto"/>
         <w:rPr>
           <w:rFonts w:ascii="Aptos" w:hAnsi="Aptos"/>
-          <w:lang w:eastAsia="zh-CN"/>
         </w:rPr>
       </w:pPr>
       <w:r>
         <w:rPr>
           <w:rFonts w:ascii="Aptos" w:hAnsi="Aptos"/>
         </w:rPr>
-        <w:t>Grab and Use Eraser (20s)</w:t>
+        <w:t>Grab and Use Eraser (</w:t>
       </w:r>
-    </w:p>
-    <w:p>
-      <w:pPr>
-        <w:pStyle w:val="ListParagraph"/>
-        <w:rPr>
-          <w:rFonts w:ascii="Aptos" w:hAnsi="Aptos"/>
-          <w:lang w:eastAsia="zh-CN"/>
-        </w:rPr>
-      </w:pPr>
-      <w:bookmarkStart w:id="4" w:name="OLE_LINK18"/>
       <w:r>
         <w:rPr>
           <w:rFonts w:ascii="Aptos" w:hAnsi="Aptos"/>
         </w:rPr>
-        <w:t>Grab</w:t>
+        <w:t>4</w:t>
       </w:r>
-      <w:bookmarkEnd w:id="4"/>
       <w:r>
         <w:rPr>
           <w:rFonts w:ascii="Aptos" w:hAnsi="Aptos"/>
         </w:rPr>
-        <w:t xml:space="preserve"> the eraser and erase part of the drawing. </w:t>
+        <w:t>0s)</w:t>
+      </w:r>
+    </w:p>
+    <w:p>
+      <w:pPr>
+        <w:pStyle w:val="ListParagraph"/>
+        <w:rPr>
+          <w:rFonts w:ascii="Aptos" w:hAnsi="Aptos"/>
+        </w:rPr>
+      </w:pPr>
+      <w:r>
+        <w:rPr>
+          <w:rFonts w:ascii="Aptos" w:hAnsi="Aptos"/>
+        </w:rPr>
+        <w:t xml:space="preserve">Grab the eraser and erase part of the drawing. </w:t>
       </w:r>
     </w:p>
     <w:p>
@@ -926,7 +894,6 @@
         <w:spacing w:after="160" w:line="278" w:lineRule="auto"/>
         <w:rPr>
           <w:rFonts w:ascii="Aptos" w:hAnsi="Aptos"/>
-          <w:lang w:eastAsia="zh-CN"/>
         </w:rPr>
       </w:pPr>
       <w:r>
@@ -941,7 +908,6 @@
         <w:pStyle w:val="ListParagraph"/>
         <w:rPr>
           <w:rFonts w:ascii="Aptos" w:hAnsi="Aptos"/>
-          <w:lang w:eastAsia="zh-CN"/>
         </w:rPr>
       </w:pPr>
       <w:r>
@@ -961,7 +927,6 @@
         <w:spacing w:after="160" w:line="278" w:lineRule="auto"/>
         <w:rPr>
           <w:rFonts w:ascii="Aptos" w:hAnsi="Aptos"/>
-          <w:lang w:eastAsia="zh-CN"/>
         </w:rPr>
       </w:pPr>
       <w:r>
@@ -976,10 +941,8 @@
         <w:pStyle w:val="ListParagraph"/>
         <w:rPr>
           <w:rFonts w:ascii="Aptos" w:hAnsi="Aptos"/>
-          <w:lang w:eastAsia="zh-CN"/>
         </w:rPr>
       </w:pPr>
-      <w:bookmarkStart w:id="5" w:name="OLE_LINK27"/>
       <w:r>
         <w:rPr>
           <w:rFonts w:ascii="Aptos" w:hAnsi="Aptos"/>
@@ -996,14 +959,7 @@
         <w:rPr>
           <w:rFonts w:ascii="Aptos" w:hAnsi="Aptos"/>
         </w:rPr>
-        <w:t xml:space="preserve"> </w:t>
-      </w:r>
-      <w:bookmarkEnd w:id="5"/>
-      <w:r>
-        <w:rPr>
-          <w:rFonts w:ascii="Aptos" w:hAnsi="Aptos"/>
-        </w:rPr>
-        <w:t>to pinch/stretch and resize the canvas.</w:t>
+        <w:t xml:space="preserve"> to pinch/stretch and resize the canvas.</w:t>
       </w:r>
     </w:p>
     <w:p>
@@ -1016,47 +972,44 @@
         <w:spacing w:after="160" w:line="278" w:lineRule="auto"/>
         <w:rPr>
           <w:rFonts w:ascii="Aptos" w:hAnsi="Aptos"/>
-          <w:lang w:eastAsia="zh-CN"/>
         </w:rPr>
       </w:pPr>
       <w:r>
         <w:rPr>
           <w:rFonts w:ascii="Aptos" w:hAnsi="Aptos"/>
         </w:rPr>
-        <w:t>Move the Canvas (20s)</w:t>
+        <w:t>Move the Canvas (</w:t>
+      </w:r>
+      <w:r>
+        <w:rPr>
+          <w:rFonts w:ascii="Aptos" w:hAnsi="Aptos"/>
+        </w:rPr>
+        <w:t>3</w:t>
+      </w:r>
+      <w:r>
+        <w:rPr>
+          <w:rFonts w:ascii="Aptos" w:hAnsi="Aptos"/>
+        </w:rPr>
+        <w:t>0s)</w:t>
       </w:r>
       <w:r>
         <w:rPr>
           <w:rFonts w:ascii="Aptos" w:hAnsi="Aptos"/>
         </w:rPr>
         <w:br/>
-      </w:r>
-      <w:r>
-        <w:rPr>
-          <w:rFonts w:ascii="Aptos" w:hAnsi="Aptos"/>
-        </w:rPr>
         <w:t xml:space="preserve">Use both hands </w:t>
       </w:r>
       <w:r>
         <w:rPr>
           <w:rFonts w:ascii="Aptos" w:hAnsi="Aptos" w:hint="eastAsia"/>
-          <w:lang w:eastAsia="zh-CN"/>
         </w:rPr>
         <w:t>t</w:t>
       </w:r>
       <w:r>
         <w:rPr>
           <w:rFonts w:ascii="Aptos" w:hAnsi="Aptos"/>
-          <w:lang w:val="en-AU" w:eastAsia="zh-CN"/>
         </w:rPr>
-        <w:t xml:space="preserve">o </w:t>
-      </w:r>
-      <w:r>
-        <w:rPr>
-          <w:rFonts w:ascii="Aptos" w:hAnsi="Aptos"/>
-          <w:lang w:eastAsia="zh-CN"/>
-        </w:rPr>
-        <w:t>g</w:t>
+        <w:t>o g</w:t>
       </w:r>
       <w:r>
         <w:rPr>
@@ -1075,25 +1028,28 @@
         <w:spacing w:after="160" w:line="278" w:lineRule="auto"/>
         <w:rPr>
           <w:rFonts w:ascii="Aptos" w:hAnsi="Aptos"/>
-          <w:lang w:eastAsia="zh-CN"/>
         </w:rPr>
       </w:pPr>
       <w:r>
         <w:rPr>
           <w:rFonts w:ascii="Aptos" w:hAnsi="Aptos"/>
         </w:rPr>
-        <w:t>Participants freely test all tools and share impressions aloud.</w:t>
+        <w:t>Participants freely test all tools and share impressions aloud. (</w:t>
       </w:r>
       <w:r>
         <w:rPr>
           <w:rFonts w:ascii="Aptos" w:hAnsi="Aptos"/>
-          <w:lang w:eastAsia="zh-CN"/>
         </w:rPr>
-        <w:t xml:space="preserve"> (30s)</w:t>
+        <w:t>~</w:t>
+      </w:r>
+      <w:r>
+        <w:rPr>
+          <w:rFonts w:ascii="Aptos" w:hAnsi="Aptos"/>
+        </w:rPr>
+        <w:t>s)</w:t>
       </w:r>
     </w:p>
     <w:bookmarkEnd w:id="1"/>
-    <w:bookmarkEnd w:id="2"/>
     <w:p>
       <w:pPr>
         <w:rPr>

</xml_diff>